<commit_message>
fix: parametriza Conclusao e Direcionamentos das 3 especialidades no template docxtpl
Co-Authored-By: Claude Sonnet 5 <noreply@anthropic.com>
Claude-Session: https://claude.ai/code/session_012M53XwiHRoSz8x6d8MkVpf
</commit_message>
<xml_diff>
--- a/src/apps/relatorio_final/templates_docx/relatorio_final_modelo.docx
+++ b/src/apps/relatorio_final/templates_docx/relatorio_final_modelo.docx
@@ -7089,7 +7089,7 @@
         <w:jc w:val="both"/>
       </w:pPr>
       <w:r>
-        <w:t>Os achados críticos da engenharia civil relacionam-se majoritariamente à segurança dos usuários e à manutenção rotineira. Destacam-se a possibilidade de obstrução do acesso à subestação, que deve ser eliminada mediante isolamento da vaga com sinalização fixa; a botoeira de alarme de incêndio obstruída por divisória no 1º pavimento; a ausência de limitadores de abertura em janelas da copa e do hall da escada de serviço do 1º pavimento; e as instalações elétricas expostas na sala de arquivo e as tomadas de piso com fios expostos no térreo.</w:t>
+        <w:t>{%p for paragrafo in conclusao_civil.split('\n\n') %}</w:t>
       </w:r>
     </w:p>
     <w:p>
@@ -7097,7 +7097,7 @@
         <w:jc w:val="both"/>
       </w:pPr>
       <w:r>
-        <w:t>No sistema hidrossanitário, os ralos sujos e obstruídos no subsolo e o acúmulo de água no fosso da área externa leste demandam limpeza e desobstrução imediatas, assim como o reparo do vazamento no barrilete da cobertura, a recomposição da proteção mecânica da impermeabilização nesse local e a substituição das válvulas de descarga defeituosas. A ausência de pintura de identificação das tubulações, no subsolo e no barrilete, deve ser corrigida para segurança da operação e da manutenção.</w:t>
+        <w:t>{{ paragrafo }}</w:t>
       </w:r>
     </w:p>
     <w:p>
@@ -7105,7 +7105,7 @@
         <w:jc w:val="both"/>
       </w:pPr>
       <w:r>
-        <w:t>Merecem atenção, ainda, o piso com desgaste e mofo na Sala SECOA, que exige recomposição da base e do revestimento, a infiltração ascendente na parede norte do subsolo e o desplacamento pontual do piso RAD executado em 2024, cuja recomposição deve ser avaliada no âmbito da garantia da obra. As 21 ocorrências em esquadrias, em sua maioria trincos, alças e janelas danificados, podem ser saneadas de forma programada pelo contrato de manutenção predial.</w:t>
+        <w:t>{%p endfor %}</w:t>
       </w:r>
     </w:p>
     <w:p>
@@ -7165,7 +7165,7 @@
         <w:jc w:val="both"/>
       </w:pPr>
       <w:r>
-        <w:t>A não conformidade de maior relevância é o rompimento da cordoalha do Sistema de Proteção contra Descargas Atmosféricas (SPDA) em diversos pontos da cobertura, associado à falta de interligação de todas as estruturas metálicas à malha de captação, classificada como Prioridade 2 com prazo de intervenção de um mês. Recomenda-se a recuperação da cordoalha e a interligação das estruturas metálicas, seguida de nova medição e emissão de laudo do SPDA nos termos da ABNT NBR 5419.</w:t>
+        <w:t>{%p for paragrafo in conclusao_eletrica.split('\n\n') %}</w:t>
       </w:r>
     </w:p>
     <w:p>
@@ -7173,7 +7173,15 @@
         <w:jc w:val="both"/>
       </w:pPr>
       <w:r>
-        <w:t>As demais ocorrências, de Prioridade 3, consistem no rompimento do condutor de equalização de potencial do grupo gerador, a ser substituído em até um mês, na presença de sujidades na canaleta do alimentador do grupo gerador e na falha da placa de comunicação da supervisão da automação predial. Todas são passíveis de execução pelos contratos de manutenção vigentes.</w:t>
+        <w:t>{{ paragrafo }}</w:t>
+      </w:r>
+    </w:p>
+    <w:p>
+      <w:pPr>
+        <w:jc w:val="both"/>
+      </w:pPr>
+      <w:r>
+        <w:t>{%p endfor %}</w:t>
       </w:r>
     </w:p>
     <w:tbl>
@@ -7424,7 +7432,7 @@
         <w:jc w:val="both"/>
       </w:pPr>
       <w:r>
-        <w:t>O elevador apresenta boas condições gerais de conservação e funcionamento, desempenho notável para equipamento instalado em 2005. Foram identificados dois achados: o guarda-corpo do topo de cabine com uma das laterais parcialmente solta, o que representa risco ao técnico de manutenção durante as intervenções, e a presença de óleo no piso do poço, que demanda a instalação de bandeja coletora para contenção do fluido lubrificante. Ambas as correções são pontuais e podem ser executadas pela empresa mantenedora no âmbito do contrato vigente.</w:t>
+        <w:t>{%p for paragrafo in conclusao_mecanica.split('\n\n') %}</w:t>
       </w:r>
     </w:p>
     <w:p>
@@ -7432,7 +7440,7 @@
         <w:jc w:val="both"/>
       </w:pPr>
       <w:r>
-        <w:t>O sistema de HVAC, em sua maior parte da época da inauguração, opera com 21 anos de uso. A central de água gelada conta com dois chillers, sendo que o mais recente, instalado em 2024, responde pela maior parte da capacidade de resfriamento. A proteção mecânica e o isolamento térmico da tubulação de água gelada que alimenta a edificação apresentam sinais de deterioração e devem ser recuperados para preservação da eficiência energética.</w:t>
+        <w:t>{{ paragrafo }}</w:t>
       </w:r>
     </w:p>
     <w:p>
@@ -7440,7 +7448,7 @@
         <w:jc w:val="both"/>
       </w:pPr>
       <w:r>
-        <w:t>O principal ponto de atenção recai sobre as unidades de climatização do tipo split instaladas no subsolo e nas guaritas. Foram identificados equipamentos inoperantes por falha de componentes e unidades com elevado tempo de uso, baseadas em tecnologia convencional de compressão e, em sua maioria, operando com fluido refrigerante R22, cuja fabricação para novos equipamentos é proibida e cuja reposição é cada vez mais escassa e onerosa. Recomenda-se a substituição dessas unidades por equipamentos com tecnologia inverter e fluidos refrigerantes de nova geração, por meio de nova contratação, com ganhos de continuidade operacional, eficiência energética, redução de custos e adequação às exigências ambientais.</w:t>
+        <w:t>{%p endfor %}</w:t>
       </w:r>
     </w:p>
     <w:tbl>

</xml_diff>